<commit_message>
paper2 CES final (honest acquisition claims)
</commit_message>
<xml_diff>
--- a/manuscript/paper2/manuscript_ces.docx
+++ b/manuscript/paper2/manuscript_ces.docx
@@ -144,7 +144,7 @@
           <w:color w:val="000000"/>
           <w:sz w:val="24"/>
         </w:rPr>
-        <w:t>Machine-learning surrogate models for ionic-liquid (IL) properties promise high-throughput electrolyte and solvent design, but their accuracy for unseen ion pairs is widely assumed to be limited by data scarcity rather than by models. Here we convert that qualitative assumption into quantitative laws. From a curated NIST ILThermo dataset of 86,008 records spanning 1,891 unique ILs with standardized units and verified SMILES, we measure how group-level accuracy R² scales with the number of ILs N under strict IL-disjoint 5-fold cross-validation for viscosity, electrical conductivity, density, and melting point. All four properties follow the learning-curve law R²(N) = a − b·N^(−γ) with property-specific exponents γ = 0.215 (viscosity), 0.807 (conductivity), 0.565 (density), and 0.288 (melting point). Viscosity—the most data-hungry property—reaches R² = 0.74 at 1,165 ILs and requires ≈5,700 ILs to approach R² = 0.80; conductivity instead saturates near R² = 0.73, revealing a representation ceiling rather than a data ceiling. We further quantify a "leakage tax": random point-wise splits inflate R² by 0.09–0.22 at full scale and by up to +0.55 in redundancy-rich strata, so evaluation discipline must be tied to the split protocol, not the dataset size. Simulated measurement campaigns over held-out ILs show that coverage-guided acquisition consistently outperforms random sampling, while uncertainty-based acquisition does not—chemical coverage, not predictive disagreement, is the binding constraint. Cold-start decomposition attributes the viscosity deficit primarily to the anion dimension. The dataset, split files, multi-model leaderboard, and a prioritized list of 100 novel ILs (from 8.3 M virtual ion pairs) are released openly.</w:t>
+        <w:t>Machine-learning surrogate models for ionic-liquid (IL) properties promise high-throughput electrolyte and solvent design, but their accuracy for unseen ion pairs is widely assumed to be limited by data scarcity rather than by models. Here we convert that qualitative assumption into quantitative laws. From a curated NIST ILThermo dataset of 86,008 records spanning 1,891 unique ILs with standardized units and verified SMILES, we measure how group-level accuracy R² scales with the number of ILs N under strict IL-disjoint 5-fold cross-validation for viscosity, electrical conductivity, density, and melting point. All four properties follow the learning-curve law R²(N) = a − b·N^(−γ) with property-specific exponents γ = 0.215 (viscosity), 0.807 (conductivity), 0.565 (density), and 0.288 (melting point). Viscosity—the most data-hungry property—reaches R² = 0.74 at 1,165 ILs and requires ≈5,700 ILs to approach R² = 0.80; conductivity instead saturates near R² = 0.73, revealing a representation ceiling rather than a data ceiling. We further quantify a "leakage tax": random point-wise splits inflate R² by 0.09–0.22 at full scale and by up to +0.55 in redundancy-rich strata, so evaluation discipline must be tied to the split protocol, not the dataset size. Simulated measurement campaigns over held-out ILs show that acquisition gains are modest and the optimal signal is property-dependent—coverage-guided ordering for the data-limited viscosity (up to +0.05 R²), predictive disagreement for conductivity—so chemical coverage, not raw measurement count, governs the remaining gap. Cold-start decomposition attributes the viscosity deficit primarily to the anion dimension. The dataset, split files, multi-model leaderboard, and a prioritized list of 100 novel ILs (from 8.3 M virtual ion pairs) are released openly.</w:t>
       </w:r>
     </w:p>
     <w:p>
@@ -2773,7 +2773,7 @@
           <w:color w:val="000000"/>
           <w:sz w:val="24"/>
         </w:rPr>
-        <w:t xml:space="preserve"> (evaluate on the remaining unseen ILs as acquisitions proceed): coverage-guided acquisition is the clear winner for viscosity—250 measurements lift R² on remaining unseen ILs to 0.89 versus 0.56 for random—but this protocol's evaluation set shrinks as acquisitions proceed, inflating the apparent gain. </w:t>
+        <w:t xml:space="preserve"> (evaluate on the remaining unseen ILs as acquisitions proceed): coverage-guided acquisition lifts R² on remaining unseen ILs to 0.89 at 250 measurements for viscosity versus 0.56 for random—but this protocol's evaluation set shrinks as acquisitions proceed, inflating the apparent gain, so the fixed-pool protocol below is the reported one. </w:t>
       </w:r>
       <w:r>
         <w:rPr>
@@ -2793,7 +2793,7 @@
           <w:color w:val="000000"/>
           <w:sz w:val="24"/>
         </w:rPr>
-        <w:t xml:space="preserve"> (150 ILs held out as a permanent evaluation set, 300 ILs as the acquisition pool; Fig. 4): coverage-guided acquisition still outperforms random at every intermediate budget (+0.05 R² at 150 measurements for viscosity; conductivity +0.04 at 100), while uncertainty-based acquisition is comparable at small budgets and degrades at large ones. The gains are modest, as the scaling laws predict: expanding the training set from 715 to 1,015 ILs at γ = 0.215 moves R² by only ≈0.03. Two conclusions follow. First, coverage-guided ordering is never worse than random and usually better—it is the rational default for allocating measurement budget. Second, at current scale the acquisition order matters less than the acquisition volume: for viscosity the binding constraint remains the sheer number of measured ILs, not their selection (consistent with §2.2). Uncertainty-based acquisition does not outperform random, consistent with the structural finding that predictor disagreement is anti-correlated with performance in this chemical space (42).</w:t>
+        <w:t xml:space="preserve"> (150 ILs held out as a permanent evaluation set, 300 ILs as the acquisition pool; Fig. 4): coverage-guided acquisition outperforms random at every budget for viscosity (+0.01 to +0.05, maximally +0.05 at 150 measurements); for conductivity the coverage advantage is small and sometimes vanishes (+0.00 to +0.05). Uncertainty-based acquisition is competitive for conductivity (+0.02 to +0.06 across budgets, its best signal), while for viscosity it is comparable or worse (+0.02 to −0.04). The gains are modest, as the scaling laws predict: expanding the training set from 715 to 1,015 ILs at γ = 0.215 moves R² by only ≈0.03. Two conclusions follow. First, the optimal acquisition signal is property-dependent—coverage for the data-limited viscosity, predictive disagreement for conductivity (42)—but no strategy is ever systematically worse than random. Second, at current scale the acquisition order matters less than the acquisition volume: for viscosity the binding constraint remains the sheer number of measured ILs, not their selection (consistent with §2.2).</w:t>
       </w:r>
     </w:p>
     <w:p>
@@ -3434,7 +3434,7 @@
           <w:color w:val="000000"/>
           <w:sz w:val="24"/>
         </w:rPr>
-        <w:t xml:space="preserve"> Coverage-guided acquisition is the rational allocation of measurement budget: it is never worse than random under either protocol, and the cold-start decomposition points to anion diversity as the specific acquisition target. The released top-100 list, split files, and one-command benchmark make these recommendations actionable and auditable.</w:t>
+        <w:t xml:space="preserve"> The acquisition simulations show that no strategy is systematically worse than random and that the best signal is property-dependent—coverage for the data-limited viscosity, predictive disagreement for conductivity—while the cold-start decomposition points to anion diversity as the specific acquisition target for viscosity. The released top-100 list, split files, and one-command benchmark make these recommendations actionable and auditable.</w:t>
       </w:r>
     </w:p>
     <w:p>
@@ -4292,7 +4292,7 @@
           <w:color w:val="000000"/>
           <w:sz w:val="24"/>
         </w:rPr>
-        <w:t>1. K. R. Seddon, Ionic liquids for clean technology, J. Chem. Technol. Biotechnol. 68 (1997) 351–356. 2. T. Welton, Room-temperature ionic liquids: Solvents for synthesis and catalysis, Chem. Rev. 99 (1999) 2071–2083. 3. M. J. Earle, K. R. Seddon, Ionic liquids: Green solvents for the future, Pure Appl. Chem. 72 (2000) 1391–1398. 4. R. D. Rogers, K. R. Seddon, Ionic liquids—solvents of the future? Science 302 (2003) 792–793. 5. M. Armand, F. Endres, D. R. MacFarlane, H. Ohno, B. Scrosati, Ionic-liquid materials for the electrochemical challenges of the future, Nat. Mater. 8 (2009) 621–629. 6. J. P. Hallett, T. Welton, Room-temperature ionic liquids: Solvents for synthesis and catalysis. 2, Chem. Rev. 111 (2011) 3508–3576. 7. Z. Lei, B. Chen, Y.-M. Koo, D. R. MacFarlane, Introduction: Ionic liquids, Chem. Rev. 117 (2017) 6633–6635. 8. R. Hayes, G. G. Warr, R. Atkin, Structure and nanostructure in ionic liquids, Chem. Rev. 115 (2015) 6357–6426. 9. K. T. Butler, D. W. Davies, H. Cartwright, O. Isayev, A. Walsh, Machine learning for molecular and materials science, Nature 559 (2018) 547–555. 10. R. Ramprasad, R. Batra, G. Pilania, A. Mannodi-Kanakkithodi, C. Kim, Machine learning in materials informatics: Recent applications and prospects, npj Comput. Mater. 3 (2017) 54. 11. L. Ward, A. Agrawal, A. Choudhary, C. Wolverton, A general-purpose machine learning framework for predicting properties of inorganic materials, npj Comput. Mater. 2 (2016) 16028. 12. G. Pilania, C. Wang, X. Jiang, S. Rajasekaran, R. Ramprasad, Accelerating materials property predictions using machine learning, Sci. Rep. 3 (2013) 2810. 13. S. Kapoor, A. Narayanan, Leakage and the reproducibility crisis in machine-learning-based science, Patterns 4 (2023) 100804. 14. A. Tropsha, P. Gramatica, V. K. Gombar, The importance of being earnest: Validation is the absolute essential for successful application and interpretation of QSPR models, QSAR Comb. Sci. 22 (2003) 69–77. 15. G. C. Cawley, N. L. C. Talbot, On over-fitting in model selection and subsequent selection bias in performance evaluation, J. Mach. Learn. Res. 11 (2010) 2079–2107. 16. I. Wallach, A. Heifets, Most ligand-based classification benchmarks reward memorization rather than generalization, J. Chem. Inf. Model. 58 (2018) 916–932. 17. F. Lin, A unified structure-based framework for honest, IL-disjoint prediction of ionic-liquid properties, under consideration at the Journal of Chemical &amp; Engineering Data (2026); preprint: ChemRxiv (2026). 18. R. L. Gardas, J. A. P. Coutinho, Extension of the Ye and Shreeve group contribution method for density estimation of ionic liquids in a wide range of temperatures and pressures, Fluid Phase Equilib. 263 (2008) 26–32. 19. K. Paduszyński, Extensive databases and group contribution QSPRs of ionic liquids properties. 2. Viscosity, Ind. Eng. Chem. Res. 58 (2019) 17049–17066. 20. X. Yu, End-to-end deep learning models for predicting the electrical conductivity of ionic liquids, ACS Sustain. Chem. Eng. (2026), doi:10.1021/acssuschemeng.6c07089. 21. R. Li, et al., Machine learning-enhanced QSPR model for predicting the viscosity of ionic liquids, Chem. Eng. Sci. 321 (2025) 122992, doi:10.1016/j.ces.2025.122992. 22. M. Barycki, A. Sosnowska, A. Gajewicz, M. Bobrowski, D. Wileńska, P. Skurski, et al., Temperature-dependent structure-property modeling of viscosity for ionic liquids, Fluid Phase Equilib. 427 (2016) 9–17. 23. D. M. Makarov, Y. A. Fadeeva, L. E. Shmukler, I. V. Tetko, Benchmarking machine learning methods for modeling physical properties of ionic liquids, J. Mol. Liq. 351 (2022) 118616. 24. A. Cherkasov, E. N. Muratov, D. Fourches, A. Varnek, I. I. Baskin, M. Cronin, et al., QSAR modeling: Where have you been? Where are you going? J. Med. Chem. 57 (2014) 4977–5010. 25. Z. Chen, J. Chen, Prediction of electrical conductivity of ionic liquids: From COSMO-RS derived QSPR evaluation to boosting machine learning, ACS Sustain. Chem. Eng. 12 (2024) 17749–17760, doi:10.1021/acssuschemeng.4c00307. 26. C. Song, C. Wang, F. Fang, G. Zhou, Z. Dai, Z. Yang, Large-scale screening for high conductivity ionic liquids via machine learning algorithm utilizing graph neural network-based features, J. Chem. Eng. Data 69 (2024) 800–810, doi:10.1021/acs.jced.3c00709. 27. K. Baran, A. Kloskowski, Graph neural networks and structural information on ionic liquids: A cheminformatics study on molecular physicochemical property prediction, J. Phys. Chem. B 127 (2023) 10542–10555, doi:10.1021/acs.jpcb.3c05521. 28. V. Venkatraman, S. Evjen, H. K. Knuutila, A. Fiksdahl, B. K. Alsberg, Predicting ionic liquid melting points using machine learning, J. Mol. Liq. 264 (2018) 318–326. 29. F. Yerly, M. Blaise, S. Barras, Machine learning models for melting point prediction of ionic liquids: CatBoost approach, CHIMIA 77 (2023) 625–629. 30. D. M. Eike, J. F. Brennecke, E. J. Maginn, Predicting melting points of quaternary ammonium ionic liquids, Green Chem. 5 (2003) 323–328. 31. "When Do Models Win? A Learning Curve Benchmark for Molecular Property Prediction in Low-Data Regimes", ChemRxiv preprint (2021), doi:10.26434/chemrxiv.15001253. [authors to be transcribed at submission] 32. F. A. Faber, L. Hutchison, B. Huang, J. Gilmer, S. S. Schoenholz, G. E. Dahl, O. Vinyals, S. Kearnes, P. F. Riley, O. A. von Lilienfeld, Prediction errors of molecular machine-learning models lower than hybrid DFT error, J. Chem. Theory Comput. 13 (2017) 5255–5264, doi:10.1021/acs.jctc.7b00577. 33. S. Minami, Y. Hayashi, S. Wu, K. Fukumizu, H. Sugisawa, M. Ishii, I. Kuwajima, K. Shiratori, R. Yoshida, Scaling law of Sim2Real transfer learning in expanding computational materials databases for real-world predictions, npj Comput. Mater. 11 (2025) 146, doi:10.1038/s41524-025-01606-5. 34. R. Gómez-Bombarelli, J. N. Wei, D. Duvenaud, J. M. Hernández-Lobato, B. Sánchez-Lengeling, D. Sheberla, et al., Automatic chemical design using a data-driven continuous representation of molecules, ACS Cent. Sci. 4 (2018) 268–276. 35. ILThermo v2.0, Ionic Liquids Database, National Institute of Standards and Technology, https://ilthermo.boulder.nist.gov/. 36. Q. Dong, C. D. Muzny, A. F. Kazakov, V. Diky, J. W. Magee, J. A. Widegren, R. D. Chirico, K. N. Marsh, M. Frenkel, ILThermo: A free-access web database for thermodynamic properties of ionic liquids, J. Chem. Eng. Data 52 (2007) 1151–1159. 37. P. Nancarrow, A. Al-Othman, D. K. Mital, S. Döpking, Comprehensive analysis and correlation of ionic liquid conductivity data for energy applications, Energy 220 (2021) 119761. 38. J. H. Friedman, Greedy function approximation: A gradient boosting machine, Ann. Stat. 29 (2001) 1189–1232. 39. G. Landrum, RDKit: Open-source cheminformatics, https://www.rdkit.org. 40. L. Himanen, A. Geurts, A. S. Foster, P. Rinke, Data-driven materials science: Status, challenges, and perspectives, Adv. Sci. 6 (2019) 1900808. 41. Z. Wu, B. Ramsundar, E. N. Feinberg, J. Gomes, C. Geniesse, A. S. Pappu, K. Leswing, V. Pande, MoleculeNet: A benchmark for molecular machine learning, Chem. Sci. 9 (2018) 513–530. 42. F. Lin, Predictor disagreement as a property-aware diagnostic for ionic-liquid property models, under consideration at Digital Discovery (2026). 43. F. Lin, Data scale unlocks generative design of ionic-liquid electrolytes, under consideration at ACS Central Science (2026). 44. R. P. Sheridan, Time-split cross-validation as a method for estimating the goodness of prospective prediction, J. Chem. Inf. Model. 53 (2013) 783–790. 45. F. Pedregosa, G. Varoquaux, A. Gramfort, V. Michel, B. Thirion, O. Grisel, et al., Scikit-learn: Machine learning in Python, J. Mach. Learn. Res. 12 (2011) 2825–2830.</w:t>
+        <w:t>1. K. R. Seddon, Ionic liquids for clean technology, J. Chem. Technol. Biotechnol. 68 (1997) 351–356. 2. T. Welton, Room-temperature ionic liquids: Solvents for synthesis and catalysis, Chem. Rev. 99 (1999) 2071–2083. 3. M. J. Earle, K. R. Seddon, Ionic liquids: Green solvents for the future, Pure Appl. Chem. 72 (2000) 1391–1398. 4. R. D. Rogers, K. R. Seddon, Ionic liquids—solvents of the future? Science 302 (2003) 792–793. 5. M. Armand, F. Endres, D. R. MacFarlane, H. Ohno, B. Scrosati, Ionic-liquid materials for the electrochemical challenges of the future, Nat. Mater. 8 (2009) 621–629. 6. J. P. Hallett, T. Welton, Room-temperature ionic liquids: Solvents for synthesis and catalysis. 2, Chem. Rev. 111 (2011) 3508–3576. 7. Z. Lei, B. Chen, Y.-M. Koo, D. R. MacFarlane, Introduction: Ionic liquids, Chem. Rev. 117 (2017) 6633–6635. 8. R. Hayes, G. G. Warr, R. Atkin, Structure and nanostructure in ionic liquids, Chem. Rev. 115 (2015) 6357–6426. 9. K. T. Butler, D. W. Davies, H. Cartwright, O. Isayev, A. Walsh, Machine learning for molecular and materials science, Nature 559 (2018) 547–555. 10. R. Ramprasad, R. Batra, G. Pilania, A. Mannodi-Kanakkithodi, C. Kim, Machine learning in materials informatics: Recent applications and prospects, npj Comput. Mater. 3 (2017) 54. 11. L. Ward, A. Agrawal, A. Choudhary, C. Wolverton, A general-purpose machine learning framework for predicting properties of inorganic materials, npj Comput. Mater. 2 (2016) 16028. 12. G. Pilania, C. Wang, X. Jiang, S. Rajasekaran, R. Ramprasad, Accelerating materials property predictions using machine learning, Sci. Rep. 3 (2013) 2810. 13. S. Kapoor, A. Narayanan, Leakage and the reproducibility crisis in machine-learning-based science, Patterns 4 (2023) 100804. 14. A. Tropsha, P. Gramatica, V. K. Gombar, The importance of being earnest: Validation is the absolute essential for successful application and interpretation of QSPR models, QSAR Comb. Sci. 22 (2003) 69–77. 15. G. C. Cawley, N. L. C. Talbot, On over-fitting in model selection and subsequent selection bias in performance evaluation, J. Mach. Learn. Res. 11 (2010) 2079–2107. 16. I. Wallach, A. Heifets, Most ligand-based classification benchmarks reward memorization rather than generalization, J. Chem. Inf. Model. 58 (2018) 916–932. 17. F. Lin, A unified structure-based framework for honest, IL-disjoint prediction of ionic-liquid properties, under consideration at the Journal of Chemical &amp; Engineering Data (2026); preprint: ChemRxiv (2026). 18. R. L. Gardas, J. A. P. Coutinho, Extension of the Ye and Shreeve group contribution method for density estimation of ionic liquids in a wide range of temperatures and pressures, Fluid Phase Equilib. 263 (2008) 26–32. 19. K. Paduszyński, Extensive databases and group contribution QSPRs of ionic liquids properties. 2. Viscosity, Ind. Eng. Chem. Res. 58 (2019) 17049–17066. 20. X. Yu, End-to-end deep learning models for predicting the electrical conductivity of ionic liquids, ACS Sustain. Chem. Eng. (2026), doi:10.1021/acssuschemeng.6c07089. 21. R. Li, et al., Machine learning-enhanced QSPR model for predicting the viscosity of ionic liquids, Chem. Eng. Sci. 321 (2025) 122992, doi:10.1016/j.ces.2025.122992. 22. M. Barycki, A. Sosnowska, A. Gajewicz, M. Bobrowski, D. Wileńska, P. Skurski, et al., Temperature-dependent structure-property modeling of viscosity for ionic liquids, Fluid Phase Equilib. 427 (2016) 9–17. 23. D. M. Makarov, Y. A. Fadeeva, L. E. Shmukler, I. V. Tetko, Benchmarking machine learning methods for modeling physical properties of ionic liquids, J. Mol. Liq. 351 (2022) 118616. 24. A. Cherkasov, E. N. Muratov, D. Fourches, A. Varnek, I. I. Baskin, M. Cronin, et al., QSAR modeling: Where have you been? Where are you going? J. Med. Chem. 57 (2014) 4977–5010. 25. Z. Chen, J. Chen, Prediction of electrical conductivity of ionic liquids: From COSMO-RS derived QSPR evaluation to boosting machine learning, ACS Sustain. Chem. Eng. 12 (2024) 17749–17760, doi:10.1021/acssuschemeng.4c00307. 26. C. Song, C. Wang, F. Fang, G. Zhou, Z. Dai, Z. Yang, Large-scale screening for high conductivity ionic liquids via machine learning algorithm utilizing graph neural network-based features, J. Chem. Eng. Data 69 (2024) 800–810, doi:10.1021/acs.jced.3c00709. 27. K. Baran, A. Kloskowski, Graph neural networks and structural information on ionic liquids: A cheminformatics study on molecular physicochemical property prediction, J. Phys. Chem. B 127 (2023) 10542–10555, doi:10.1021/acs.jpcb.3c05521. 28. V. Venkatraman, S. Evjen, H. K. Knuutila, A. Fiksdahl, B. K. Alsberg, Predicting ionic liquid melting points using machine learning, J. Mol. Liq. 264 (2018) 318–326. 29. F. Yerly, M. Blaise, S. Barras, Machine learning models for melting point prediction of ionic liquids: CatBoost approach, CHIMIA 77 (2023) 625–629. 30. D. M. Eike, J. F. Brennecke, E. J. Maginn, Predicting melting points of quaternary ammonium ionic liquids, Green Chem. 5 (2003) 323–328. 31. "When Do Models Win? A Learning Curve Benchmark for Molecular Property Prediction in Low-Data Regimes", ChemRxiv preprint (2021), doi:10.26434/chemrxiv.15001253. [authors to be transcribed at submission] 32. F. A. Faber, L. Hutchison, B. Huang, J. Gilmer, S. S. Schoenholz, G. E. Dahl, O. Vinyals, S. Kearnes, P. F. Riley, O. A. von Lilienfeld, Prediction errors of molecular machine-learning models lower than hybrid DFT error, J. Chem. Theory Comput. 13 (2017) 5255–5264, doi:10.1021/acs.jctc.7b00577. 33. S. Minami, Y. Hayashi, S. Wu, K. Fukumizu, H. Sugisawa, M. Ishii, I. Kuwajima, K. Shiratori, R. Yoshida, Scaling law of Sim2Real transfer learning in expanding computational materials databases for real-world predictions, npj Comput. Mater. 11 (2025) 146, doi:10.1038/s41524-025-01606-5. 34. R. Gómez-Bombarelli, J. N. Wei, D. Duvenaud, J. M. Hernández-Lobato, B. Sánchez-Lengeling, D. Sheberla, et al., Automatic chemical design using a data-driven continuous representation of molecules, ACS Cent. Sci. 4 (2018) 268–276. 35. ILThermo v2.0, Ionic Liquids Database, National Institute of Standards and Technology, https://ilthermo.boulder.nist.gov/. 36. Q. Dong, C. D. Muzny, A. F. Kazakov, V. Diky, J. W. Magee, J. A. Widegren, R. D. Chirico, K. N. Marsh, M. Frenkel, ILThermo: A free-access web database for thermodynamic properties of ionic liquids, J. Chem. Eng. Data 52 (2007) 1151–1159. 37. F. Pedregosa, G. Varoquaux, A. Gramfort, V. Michel, B. Thirion, O. Grisel, et al., Scikit-learn: Machine learning in Python, J. Mach. Learn. Res. 12 (2011) 2825–2830. 38. J. H. Friedman, Greedy function approximation: A gradient boosting machine, Ann. Stat. 29 (2001) 1189–1232. 39. G. Landrum, RDKit: Open-source cheminformatics, https://www.rdkit.org. 40. L. Himanen, A. Geurts, A. S. Foster, P. Rinke, Data-driven materials science: Status, challenges, and perspectives, Adv. Sci. 6 (2019) 1900808. 41. Z. Wu, B. Ramsundar, E. N. Feinberg, J. Gomes, C. Geniesse, A. S. Pappu, K. Leswing, V. Pande, MoleculeNet: A benchmark for molecular machine learning, Chem. Sci. 9 (2018) 513–530. 42. F. Lin, Predictor disagreement as a property-aware diagnostic for ionic-liquid property models, under consideration at Digital Discovery (2026). 43. F. Lin, Data scale unlocks generative design of ionic-liquid electrolytes, under consideration at ACS Central Science (2026). 44. R. P. Sheridan, Time-split cross-validation as a method for estimating the goodness of prospective prediction, J. Chem. Inf. Model. 53 (2013) 783–790. 45. P. Nancarrow, A. Al-Othman, D. K. Mital, S. Döpking, Comprehensive analysis and correlation of ionic liquid conductivity data for energy applications, Energy 220 (2021) 119761.</w:t>
       </w:r>
     </w:p>
     <w:sectPr>

</xml_diff>